<commit_message>
Atualização da formatação do rodapé
</commit_message>
<xml_diff>
--- a/templates/Conteudo_Fonte.docx
+++ b/templates/Conteudo_Fonte.docx
@@ -672,21 +672,6 @@
     <w:p>
       <w:pPr>
         <w:pStyle w:val="Default"/>
-        <w:spacing w:line="360" w:lineRule="auto"/>
-        <w:ind w:firstLine="720"/>
-        <w:jc w:val="both"/>
-        <w:rPr>
-          <w:rFonts w:asciiTheme="majorHAnsi" w:hAnsiTheme="majorHAnsi" w:cstheme="majorHAnsi"/>
-          <w:bCs/>
-          <w:color w:val="auto"/>
-          <w:szCs w:val="22"/>
-        </w:rPr>
-      </w:pPr>
-    </w:p>
-    <w:p>
-      <w:pPr>
-        <w:pStyle w:val="Default"/>
-        <w:spacing w:line="360" w:lineRule="auto"/>
         <w:ind w:firstLine="720"/>
         <w:jc w:val="both"/>
         <w:rPr>
@@ -709,7 +694,6 @@
     <w:p>
       <w:pPr>
         <w:pStyle w:val="Default"/>
-        <w:spacing w:line="360" w:lineRule="auto"/>
         <w:ind w:firstLine="720"/>
         <w:jc w:val="both"/>
         <w:rPr>
@@ -749,7 +733,7 @@
     </w:p>
     <w:p>
       <w:pPr>
-        <w:spacing w:line="360" w:lineRule="auto"/>
+        <w:spacing w:line="240" w:lineRule="auto"/>
         <w:ind w:firstLine="720"/>
         <w:jc w:val="both"/>
         <w:rPr>
@@ -771,7 +755,7 @@
     </w:p>
     <w:p>
       <w:pPr>
-        <w:spacing w:after="60"/>
+        <w:spacing w:after="60" w:line="240" w:lineRule="auto"/>
         <w:rPr>
           <w:rFonts w:ascii="Arial" w:hAnsi="Arial"/>
           <w:color w:val="0000FF"/>
@@ -790,7 +774,6 @@
     <w:p>
       <w:pPr>
         <w:pStyle w:val="Default"/>
-        <w:spacing w:line="360" w:lineRule="auto"/>
         <w:ind w:firstLine="720"/>
         <w:jc w:val="both"/>
         <w:rPr>
@@ -888,25 +871,26 @@
     </w:p>
     <w:p>
       <w:pPr>
-        <w:spacing w:after="60"/>
+        <w:pStyle w:val="Default"/>
+        <w:jc w:val="both"/>
         <w:rPr>
           <w:rFonts w:ascii="Arial" w:hAnsi="Arial"/>
           <w:color w:val="0000FF"/>
-          <w:lang w:val="pt-BR"/>
         </w:rPr>
       </w:pPr>
+      <w:bookmarkStart w:id="1" w:name="_GoBack"/>
+      <w:bookmarkEnd w:id="1"/>
       <w:r>
         <w:rPr>
           <w:rFonts w:ascii="Arial" w:hAnsi="Arial"/>
           <w:color w:val="0000FF"/>
-          <w:lang w:val="pt-BR"/>
         </w:rPr>
         <w:t>[QUEBRA_PAGINA]</w:t>
       </w:r>
     </w:p>
     <w:p>
       <w:pPr>
-        <w:spacing w:after="60"/>
+        <w:spacing w:after="60" w:line="240" w:lineRule="auto"/>
         <w:rPr>
           <w:rFonts w:ascii="Arial" w:hAnsi="Arial"/>
           <w:color w:val="0000FF"/>
@@ -1125,14 +1109,7 @@
         <w:rPr>
           <w:rFonts w:asciiTheme="majorHAnsi" w:hAnsiTheme="majorHAnsi" w:cstheme="majorHAnsi"/>
         </w:rPr>
-        <w:t xml:space="preserve"> metas) das metas estabelecidas </w:t>
-      </w:r>
-      <w:r>
-        <w:rPr>
-          <w:rFonts w:asciiTheme="majorHAnsi" w:hAnsiTheme="majorHAnsi" w:cstheme="majorHAnsi"/>
-        </w:rPr>
-        <w:lastRenderedPageBreak/>
-        <w:t xml:space="preserve">obtiveram resultado inferior a 70%. Já, as demais, </w:t>
+        <w:t xml:space="preserve"> metas) das metas estabelecidas obtiveram resultado inferior a 70%. Já, as demais, </w:t>
       </w:r>
       <w:r>
         <w:rPr>
@@ -1248,6 +1225,7 @@
           <w:szCs w:val="24"/>
           <w:lang w:val="pt-BR" w:eastAsia="pt-BR"/>
         </w:rPr>
+        <w:lastRenderedPageBreak/>
         <w:t>A seguir, são apresentados os resultados obtidos pelo TJMG em 2024 nas metas nacionais do Poder Judiciário.</w:t>
       </w:r>
     </w:p>
@@ -1260,8 +1238,6 @@
           <w:lang w:val="pt-BR"/>
         </w:rPr>
       </w:pPr>
-      <w:bookmarkStart w:id="1" w:name="_GoBack"/>
-      <w:bookmarkEnd w:id="1"/>
       <w:r>
         <w:rPr>
           <w:rFonts w:ascii="Arial" w:hAnsi="Arial"/>
@@ -13622,7 +13598,7 @@
 </file>
 
 <file path=customXml/itemProps1.xml><?xml version="1.0" encoding="utf-8"?>
-<ds:datastoreItem xmlns:ds="http://schemas.openxmlformats.org/officeDocument/2006/customXml" ds:itemID="{FCEDBC2C-8952-4EE8-B7F0-F4D7E2219B73}">
+<ds:datastoreItem xmlns:ds="http://schemas.openxmlformats.org/officeDocument/2006/customXml" ds:itemID="{E3A849D0-6BD8-4BE5-AA36-68B2FCED0A68}">
   <ds:schemaRefs>
     <ds:schemaRef ds:uri="http://schemas.openxmlformats.org/officeDocument/2006/bibliography"/>
   </ds:schemaRefs>

</xml_diff>

<commit_message>
Formatação final e inclusão da opção de sumário
</commit_message>
<xml_diff>
--- a/templates/Conteudo_Fonte.docx
+++ b/templates/Conteudo_Fonte.docx
@@ -878,8 +878,6 @@
           <w:color w:val="0000FF"/>
         </w:rPr>
       </w:pPr>
-      <w:bookmarkStart w:id="1" w:name="_GoBack"/>
-      <w:bookmarkEnd w:id="1"/>
       <w:r>
         <w:rPr>
           <w:rFonts w:ascii="Arial" w:hAnsi="Arial"/>
@@ -1144,6 +1142,7 @@
         <w:rPr>
           <w:rFonts w:ascii="Arial" w:hAnsi="Arial"/>
           <w:color w:val="0000FF"/>
+          <w:u w:val="single"/>
         </w:rPr>
       </w:pPr>
       <w:r>
@@ -1156,20 +1155,29 @@
     </w:p>
     <w:p>
       <w:pPr>
-        <w:pStyle w:val="textojustificadorecuoprimeiralinha"/>
-        <w:spacing w:before="0" w:beforeAutospacing="0" w:after="200" w:afterAutospacing="0" w:line="360" w:lineRule="auto"/>
+        <w:spacing w:after="120" w:line="360" w:lineRule="auto"/>
         <w:jc w:val="both"/>
         <w:rPr>
-          <w:rFonts w:asciiTheme="majorHAnsi" w:hAnsiTheme="majorHAnsi" w:cstheme="majorHAnsi"/>
+          <w:rFonts w:ascii="Arial" w:hAnsi="Arial"/>
+          <w:b/>
+          <w:color w:val="E36C0A"/>
+          <w:sz w:val="28"/>
+          <w:u w:val="single"/>
+          <w:lang w:val="pt-BR"/>
         </w:rPr>
       </w:pPr>
       <w:r>
         <w:rPr>
           <w:rFonts w:ascii="Arial" w:hAnsi="Arial"/>
-          <w:color w:val="0000FF"/>
-        </w:rPr>
-        <w:t>[QUEBRA_PAGINA]</w:t>
+          <w:b/>
+          <w:color w:val="E36C0A"/>
+          <w:sz w:val="28"/>
+          <w:lang w:val="pt-BR"/>
+        </w:rPr>
+        <w:t>4.1 METAS NACIONAIS</w:t>
       </w:r>
+      <w:bookmarkStart w:id="1" w:name="_GoBack"/>
+      <w:bookmarkEnd w:id="1"/>
     </w:p>
     <w:p>
       <w:pPr>
@@ -1177,41 +1185,6 @@
         <w:jc w:val="both"/>
         <w:outlineLvl w:val="0"/>
         <w:rPr>
-          <w:rFonts w:ascii="Arial" w:hAnsi="Arial"/>
-          <w:color w:val="0000FF"/>
-          <w:lang w:val="pt-BR"/>
-        </w:rPr>
-      </w:pPr>
-    </w:p>
-    <w:p>
-      <w:pPr>
-        <w:spacing w:after="120" w:line="360" w:lineRule="auto"/>
-        <w:jc w:val="both"/>
-        <w:rPr>
-          <w:rFonts w:ascii="Arial" w:hAnsi="Arial"/>
-          <w:b/>
-          <w:color w:val="E36C0A"/>
-          <w:sz w:val="28"/>
-          <w:lang w:val="pt-BR"/>
-        </w:rPr>
-      </w:pPr>
-      <w:r>
-        <w:rPr>
-          <w:rFonts w:ascii="Arial" w:hAnsi="Arial"/>
-          <w:b/>
-          <w:color w:val="E36C0A"/>
-          <w:sz w:val="28"/>
-          <w:lang w:val="pt-BR"/>
-        </w:rPr>
-        <w:t>4.1 METAS NACIONAIS</w:t>
-      </w:r>
-    </w:p>
-    <w:p>
-      <w:pPr>
-        <w:spacing w:after="0" w:line="240" w:lineRule="auto"/>
-        <w:jc w:val="both"/>
-        <w:outlineLvl w:val="0"/>
-        <w:rPr>
           <w:rFonts w:asciiTheme="majorHAnsi" w:eastAsia="Times New Roman" w:hAnsiTheme="majorHAnsi" w:cstheme="majorHAnsi"/>
           <w:sz w:val="24"/>
           <w:szCs w:val="24"/>
@@ -1225,7 +1198,6 @@
           <w:szCs w:val="24"/>
           <w:lang w:val="pt-BR" w:eastAsia="pt-BR"/>
         </w:rPr>
-        <w:lastRenderedPageBreak/>
         <w:t>A seguir, são apresentados os resultados obtidos pelo TJMG em 2024 nas metas nacionais do Poder Judiciário.</w:t>
       </w:r>
     </w:p>
@@ -1244,6 +1216,7 @@
           <w:color w:val="0000FF"/>
           <w:lang w:val="pt-BR"/>
         </w:rPr>
+        <w:lastRenderedPageBreak/>
         <w:t>[INSERIR_TABELA_CNJ]</w:t>
       </w:r>
     </w:p>
@@ -13598,7 +13571,7 @@
 </file>
 
 <file path=customXml/itemProps1.xml><?xml version="1.0" encoding="utf-8"?>
-<ds:datastoreItem xmlns:ds="http://schemas.openxmlformats.org/officeDocument/2006/customXml" ds:itemID="{E3A849D0-6BD8-4BE5-AA36-68B2FCED0A68}">
+<ds:datastoreItem xmlns:ds="http://schemas.openxmlformats.org/officeDocument/2006/customXml" ds:itemID="{2E89C91D-C27D-49B9-ABD8-9E5920DCDFD7}">
   <ds:schemaRefs>
     <ds:schemaRef ds:uri="http://schemas.openxmlformats.org/officeDocument/2006/bibliography"/>
   </ds:schemaRefs>

</xml_diff>